<commit_message>
Prefill doc data and enhance admin/applicant forms
Controller: add logic to load doc_2 committee names for auto-fill and to read existing doc_1 applicant data into the model so admin form can display applicant inputs.

Templates: update academic/admin/document_form.html and academic/applicant/new_request.html to add hidden checkbox fields, checkbox toggles, default Thai date classes and JS (auto-fill Thai dates), prefill committee dropdowns/positions from doc_2, rename some inputs (dropdownDeanName, dropdownHr, dropdownCsHeadName, etc.), and adjust form layout for better UX. Add JS to sync visible checkboxes with hidden values.

Other: update docx template (doc_2.docx) and add uploaded doc_2.docx; compiled class and template artifacts updated.
</commit_message>
<xml_diff>
--- a/shopping-cart-spring-boot-main/src/main/resources/templates/docx/doc_2.docx
+++ b/shopping-cart-spring-boot-main/src/main/resources/templates/docx/doc_2.docx
@@ -4,7 +4,7 @@
   <w:body>
     <w:tbl>
       <w:tblPr>
-        <w:tblStyle w:val="ae"/>
+        <w:tblStyle w:val="TableGrid"/>
         <w:tblW w:w="9990" w:type="dxa"/>
         <w:tblInd w:w="-185" w:type="dxa"/>
         <w:tblLook w:val="04A0" w:firstRow="1" w:lastRow="0" w:firstColumn="1" w:lastColumn="0" w:noHBand="0" w:noVBand="1"/>
@@ -206,7 +206,7 @@
           <w:p>
             <w:pPr>
               <w:rPr>
-                <w:rFonts w:ascii="TH Sarabun New" w:eastAsia="Times New Roman" w:hAnsi="TH Sarabun New" w:cs="TH Sarabun New" w:hint="cs"/>
+                <w:rFonts w:ascii="TH Sarabun New" w:eastAsia="Times New Roman" w:hAnsi="TH Sarabun New" w:cs="TH Sarabun New"/>
                 <w:sz w:val="28"/>
                 <w:szCs w:val="28"/>
                 <w:cs/>
@@ -803,7 +803,7 @@
     </w:p>
     <w:tbl>
       <w:tblPr>
-        <w:tblStyle w:val="ae"/>
+        <w:tblStyle w:val="TableGrid"/>
         <w:tblW w:w="9945" w:type="dxa"/>
         <w:tblInd w:w="-185" w:type="dxa"/>
         <w:tblLook w:val="04A0" w:firstRow="1" w:lastRow="0" w:firstColumn="1" w:lastColumn="0" w:noHBand="0" w:noVBand="1"/>
@@ -1478,9 +1478,8 @@
                 <w:szCs w:val="28"/>
                 <w:lang w:eastAsia="en-GB"/>
               </w:rPr>
-              <w:t>chk_dean_</w:t>
-            </w:r>
-            <w:proofErr w:type="gramStart"/>
+              <w:t>chk_dean_sign</w:t>
+            </w:r>
             <w:r>
               <w:rPr>
                 <w:rFonts w:ascii="TH Sarabun New" w:eastAsia="Times New Roman" w:hAnsi="TH Sarabun New" w:cs="TH Sarabun New"/>
@@ -1488,15 +1487,6 @@
                 <w:szCs w:val="28"/>
                 <w:lang w:eastAsia="en-GB"/>
               </w:rPr>
-              <w:t>sign</w:t>
-            </w:r>
-            <w:r>
-              <w:rPr>
-                <w:rFonts w:ascii="TH Sarabun New" w:eastAsia="Times New Roman" w:hAnsi="TH Sarabun New" w:cs="TH Sarabun New"/>
-                <w:sz w:val="28"/>
-                <w:szCs w:val="28"/>
-                <w:lang w:eastAsia="en-GB"/>
-              </w:rPr>
               <w:t>3</w:t>
             </w:r>
             <w:r>
@@ -1515,7 +1505,6 @@
               </w:rPr>
               <w:t>)</w:t>
             </w:r>
-            <w:proofErr w:type="gramEnd"/>
             <w:r>
               <w:rPr>
                 <w:rFonts w:ascii="TH Sarabun New" w:eastAsia="Times New Roman" w:hAnsi="TH Sarabun New" w:cs="TH Sarabun New"/>
@@ -1588,6 +1577,15 @@
               </w:rPr>
               <w:t>(</w:t>
             </w:r>
+            <w:r>
+              <w:rPr>
+                <w:rFonts w:ascii="TH Sarabun New" w:eastAsia="Times New Roman" w:hAnsi="TH Sarabun New" w:cs="TH Sarabun New"/>
+                <w:sz w:val="28"/>
+                <w:szCs w:val="28"/>
+                <w:lang w:val="en-US" w:eastAsia="en-GB"/>
+              </w:rPr>
+              <w:t>{{</w:t>
+            </w:r>
             <w:proofErr w:type="spellStart"/>
             <w:r>
               <w:rPr>
@@ -1599,6 +1597,15 @@
               <w:t>dropdownDeanName</w:t>
             </w:r>
             <w:proofErr w:type="spellEnd"/>
+            <w:r>
+              <w:rPr>
+                <w:rFonts w:ascii="TH Sarabun New" w:eastAsia="Times New Roman" w:hAnsi="TH Sarabun New" w:cs="TH Sarabun New"/>
+                <w:sz w:val="28"/>
+                <w:szCs w:val="28"/>
+                <w:lang w:val="en-US" w:eastAsia="en-GB"/>
+              </w:rPr>
+              <w:t>}}</w:t>
+            </w:r>
             <w:r>
               <w:rPr>
                 <w:rFonts w:ascii="TH Sarabun New" w:eastAsia="Times New Roman" w:hAnsi="TH Sarabun New" w:cs="TH Sarabun New" w:hint="cs"/>
@@ -2123,7 +2130,7 @@
     <w:lsdException w:name="Unresolved Mention" w:semiHidden="1" w:unhideWhenUsed="1"/>
     <w:lsdException w:name="Smart Link" w:semiHidden="1" w:unhideWhenUsed="1"/>
   </w:latentStyles>
-  <w:style w:type="paragraph" w:default="1" w:styleId="a">
+  <w:style w:type="paragraph" w:default="1" w:styleId="Normal">
     <w:name w:val="Normal"/>
     <w:qFormat/>
     <w:rsid w:val="00824612"/>
@@ -2139,11 +2146,11 @@
       <w14:ligatures w14:val="none"/>
     </w:rPr>
   </w:style>
-  <w:style w:type="paragraph" w:styleId="1">
+  <w:style w:type="paragraph" w:styleId="Heading1">
     <w:name w:val="heading 1"/>
-    <w:basedOn w:val="a"/>
-    <w:next w:val="a"/>
-    <w:link w:val="10"/>
+    <w:basedOn w:val="Normal"/>
+    <w:next w:val="Normal"/>
+    <w:link w:val="Heading1Char"/>
     <w:uiPriority w:val="9"/>
     <w:qFormat/>
     <w:rsid w:val="00824612"/>
@@ -2163,11 +2170,11 @@
       <w14:ligatures w14:val="standardContextual"/>
     </w:rPr>
   </w:style>
-  <w:style w:type="paragraph" w:styleId="2">
+  <w:style w:type="paragraph" w:styleId="Heading2">
     <w:name w:val="heading 2"/>
-    <w:basedOn w:val="a"/>
-    <w:next w:val="a"/>
-    <w:link w:val="20"/>
+    <w:basedOn w:val="Normal"/>
+    <w:next w:val="Normal"/>
+    <w:link w:val="Heading2Char"/>
     <w:uiPriority w:val="9"/>
     <w:semiHidden/>
     <w:unhideWhenUsed/>
@@ -2189,11 +2196,11 @@
       <w14:ligatures w14:val="standardContextual"/>
     </w:rPr>
   </w:style>
-  <w:style w:type="paragraph" w:styleId="3">
+  <w:style w:type="paragraph" w:styleId="Heading3">
     <w:name w:val="heading 3"/>
-    <w:basedOn w:val="a"/>
-    <w:next w:val="a"/>
-    <w:link w:val="30"/>
+    <w:basedOn w:val="Normal"/>
+    <w:next w:val="Normal"/>
+    <w:link w:val="Heading3Char"/>
     <w:uiPriority w:val="9"/>
     <w:semiHidden/>
     <w:unhideWhenUsed/>
@@ -2215,11 +2222,11 @@
       <w14:ligatures w14:val="standardContextual"/>
     </w:rPr>
   </w:style>
-  <w:style w:type="paragraph" w:styleId="4">
+  <w:style w:type="paragraph" w:styleId="Heading4">
     <w:name w:val="heading 4"/>
-    <w:basedOn w:val="a"/>
-    <w:next w:val="a"/>
-    <w:link w:val="40"/>
+    <w:basedOn w:val="Normal"/>
+    <w:next w:val="Normal"/>
+    <w:link w:val="Heading4Char"/>
     <w:uiPriority w:val="9"/>
     <w:semiHidden/>
     <w:unhideWhenUsed/>
@@ -2243,11 +2250,11 @@
       <w14:ligatures w14:val="standardContextual"/>
     </w:rPr>
   </w:style>
-  <w:style w:type="paragraph" w:styleId="5">
+  <w:style w:type="paragraph" w:styleId="Heading5">
     <w:name w:val="heading 5"/>
-    <w:basedOn w:val="a"/>
-    <w:next w:val="a"/>
-    <w:link w:val="50"/>
+    <w:basedOn w:val="Normal"/>
+    <w:next w:val="Normal"/>
+    <w:link w:val="Heading5Char"/>
     <w:uiPriority w:val="9"/>
     <w:semiHidden/>
     <w:unhideWhenUsed/>
@@ -2269,11 +2276,11 @@
       <w14:ligatures w14:val="standardContextual"/>
     </w:rPr>
   </w:style>
-  <w:style w:type="paragraph" w:styleId="6">
+  <w:style w:type="paragraph" w:styleId="Heading6">
     <w:name w:val="heading 6"/>
-    <w:basedOn w:val="a"/>
-    <w:next w:val="a"/>
-    <w:link w:val="60"/>
+    <w:basedOn w:val="Normal"/>
+    <w:next w:val="Normal"/>
+    <w:link w:val="Heading6Char"/>
     <w:uiPriority w:val="9"/>
     <w:semiHidden/>
     <w:unhideWhenUsed/>
@@ -2297,11 +2304,11 @@
       <w14:ligatures w14:val="standardContextual"/>
     </w:rPr>
   </w:style>
-  <w:style w:type="paragraph" w:styleId="7">
+  <w:style w:type="paragraph" w:styleId="Heading7">
     <w:name w:val="heading 7"/>
-    <w:basedOn w:val="a"/>
-    <w:next w:val="a"/>
-    <w:link w:val="70"/>
+    <w:basedOn w:val="Normal"/>
+    <w:next w:val="Normal"/>
+    <w:link w:val="Heading7Char"/>
     <w:uiPriority w:val="9"/>
     <w:semiHidden/>
     <w:unhideWhenUsed/>
@@ -2323,11 +2330,11 @@
       <w14:ligatures w14:val="standardContextual"/>
     </w:rPr>
   </w:style>
-  <w:style w:type="paragraph" w:styleId="8">
+  <w:style w:type="paragraph" w:styleId="Heading8">
     <w:name w:val="heading 8"/>
-    <w:basedOn w:val="a"/>
-    <w:next w:val="a"/>
-    <w:link w:val="80"/>
+    <w:basedOn w:val="Normal"/>
+    <w:next w:val="Normal"/>
+    <w:link w:val="Heading8Char"/>
     <w:uiPriority w:val="9"/>
     <w:semiHidden/>
     <w:unhideWhenUsed/>
@@ -2351,11 +2358,11 @@
       <w14:ligatures w14:val="standardContextual"/>
     </w:rPr>
   </w:style>
-  <w:style w:type="paragraph" w:styleId="9">
+  <w:style w:type="paragraph" w:styleId="Heading9">
     <w:name w:val="heading 9"/>
-    <w:basedOn w:val="a"/>
-    <w:next w:val="a"/>
-    <w:link w:val="90"/>
+    <w:basedOn w:val="Normal"/>
+    <w:next w:val="Normal"/>
+    <w:link w:val="Heading9Char"/>
     <w:uiPriority w:val="9"/>
     <w:semiHidden/>
     <w:unhideWhenUsed/>
@@ -2377,12 +2384,13 @@
       <w14:ligatures w14:val="standardContextual"/>
     </w:rPr>
   </w:style>
-  <w:style w:type="character" w:default="1" w:styleId="a0">
+  <w:style w:type="character" w:default="1" w:styleId="DefaultParagraphFont">
     <w:name w:val="Default Paragraph Font"/>
     <w:uiPriority w:val="1"/>
+    <w:semiHidden/>
     <w:unhideWhenUsed/>
   </w:style>
-  <w:style w:type="table" w:default="1" w:styleId="a1">
+  <w:style w:type="table" w:default="1" w:styleId="TableNormal">
     <w:name w:val="Normal Table"/>
     <w:uiPriority w:val="99"/>
     <w:semiHidden/>
@@ -2397,16 +2405,16 @@
       </w:tblCellMar>
     </w:tblPr>
   </w:style>
-  <w:style w:type="numbering" w:default="1" w:styleId="a2">
+  <w:style w:type="numbering" w:default="1" w:styleId="NoList">
     <w:name w:val="No List"/>
     <w:uiPriority w:val="99"/>
     <w:semiHidden/>
     <w:unhideWhenUsed/>
   </w:style>
-  <w:style w:type="character" w:customStyle="1" w:styleId="10">
-    <w:name w:val="หัวเรื่อง 1 อักขระ"/>
-    <w:basedOn w:val="a0"/>
-    <w:link w:val="1"/>
+  <w:style w:type="character" w:customStyle="1" w:styleId="Heading1Char">
+    <w:name w:val="Heading 1 Char"/>
+    <w:basedOn w:val="DefaultParagraphFont"/>
+    <w:link w:val="Heading1"/>
     <w:uiPriority w:val="9"/>
     <w:rsid w:val="00824612"/>
     <w:rPr>
@@ -2416,10 +2424,10 @@
       <w:szCs w:val="50"/>
     </w:rPr>
   </w:style>
-  <w:style w:type="character" w:customStyle="1" w:styleId="20">
-    <w:name w:val="หัวเรื่อง 2 อักขระ"/>
-    <w:basedOn w:val="a0"/>
-    <w:link w:val="2"/>
+  <w:style w:type="character" w:customStyle="1" w:styleId="Heading2Char">
+    <w:name w:val="Heading 2 Char"/>
+    <w:basedOn w:val="DefaultParagraphFont"/>
+    <w:link w:val="Heading2"/>
     <w:uiPriority w:val="9"/>
     <w:semiHidden/>
     <w:rsid w:val="00824612"/>
@@ -2430,10 +2438,10 @@
       <w:szCs w:val="40"/>
     </w:rPr>
   </w:style>
-  <w:style w:type="character" w:customStyle="1" w:styleId="30">
-    <w:name w:val="หัวเรื่อง 3 อักขระ"/>
-    <w:basedOn w:val="a0"/>
-    <w:link w:val="3"/>
+  <w:style w:type="character" w:customStyle="1" w:styleId="Heading3Char">
+    <w:name w:val="Heading 3 Char"/>
+    <w:basedOn w:val="DefaultParagraphFont"/>
+    <w:link w:val="Heading3"/>
     <w:uiPriority w:val="9"/>
     <w:semiHidden/>
     <w:rsid w:val="00824612"/>
@@ -2444,10 +2452,10 @@
       <w:szCs w:val="35"/>
     </w:rPr>
   </w:style>
-  <w:style w:type="character" w:customStyle="1" w:styleId="40">
-    <w:name w:val="หัวเรื่อง 4 อักขระ"/>
-    <w:basedOn w:val="a0"/>
-    <w:link w:val="4"/>
+  <w:style w:type="character" w:customStyle="1" w:styleId="Heading4Char">
+    <w:name w:val="Heading 4 Char"/>
+    <w:basedOn w:val="DefaultParagraphFont"/>
+    <w:link w:val="Heading4"/>
     <w:uiPriority w:val="9"/>
     <w:semiHidden/>
     <w:rsid w:val="00824612"/>
@@ -2458,10 +2466,10 @@
       <w:color w:val="2F5496" w:themeColor="accent1" w:themeShade="BF"/>
     </w:rPr>
   </w:style>
-  <w:style w:type="character" w:customStyle="1" w:styleId="50">
-    <w:name w:val="หัวเรื่อง 5 อักขระ"/>
-    <w:basedOn w:val="a0"/>
-    <w:link w:val="5"/>
+  <w:style w:type="character" w:customStyle="1" w:styleId="Heading5Char">
+    <w:name w:val="Heading 5 Char"/>
+    <w:basedOn w:val="DefaultParagraphFont"/>
+    <w:link w:val="Heading5"/>
     <w:uiPriority w:val="9"/>
     <w:semiHidden/>
     <w:rsid w:val="00824612"/>
@@ -2470,10 +2478,10 @@
       <w:color w:val="2F5496" w:themeColor="accent1" w:themeShade="BF"/>
     </w:rPr>
   </w:style>
-  <w:style w:type="character" w:customStyle="1" w:styleId="60">
-    <w:name w:val="หัวเรื่อง 6 อักขระ"/>
-    <w:basedOn w:val="a0"/>
-    <w:link w:val="6"/>
+  <w:style w:type="character" w:customStyle="1" w:styleId="Heading6Char">
+    <w:name w:val="Heading 6 Char"/>
+    <w:basedOn w:val="DefaultParagraphFont"/>
+    <w:link w:val="Heading6"/>
     <w:uiPriority w:val="9"/>
     <w:semiHidden/>
     <w:rsid w:val="00824612"/>
@@ -2484,10 +2492,10 @@
       <w:color w:val="595959" w:themeColor="text1" w:themeTint="A6"/>
     </w:rPr>
   </w:style>
-  <w:style w:type="character" w:customStyle="1" w:styleId="70">
-    <w:name w:val="หัวเรื่อง 7 อักขระ"/>
-    <w:basedOn w:val="a0"/>
-    <w:link w:val="7"/>
+  <w:style w:type="character" w:customStyle="1" w:styleId="Heading7Char">
+    <w:name w:val="Heading 7 Char"/>
+    <w:basedOn w:val="DefaultParagraphFont"/>
+    <w:link w:val="Heading7"/>
     <w:uiPriority w:val="9"/>
     <w:semiHidden/>
     <w:rsid w:val="00824612"/>
@@ -2496,10 +2504,10 @@
       <w:color w:val="595959" w:themeColor="text1" w:themeTint="A6"/>
     </w:rPr>
   </w:style>
-  <w:style w:type="character" w:customStyle="1" w:styleId="80">
-    <w:name w:val="หัวเรื่อง 8 อักขระ"/>
-    <w:basedOn w:val="a0"/>
-    <w:link w:val="8"/>
+  <w:style w:type="character" w:customStyle="1" w:styleId="Heading8Char">
+    <w:name w:val="Heading 8 Char"/>
+    <w:basedOn w:val="DefaultParagraphFont"/>
+    <w:link w:val="Heading8"/>
     <w:uiPriority w:val="9"/>
     <w:semiHidden/>
     <w:rsid w:val="00824612"/>
@@ -2510,10 +2518,10 @@
       <w:color w:val="272727" w:themeColor="text1" w:themeTint="D8"/>
     </w:rPr>
   </w:style>
-  <w:style w:type="character" w:customStyle="1" w:styleId="90">
-    <w:name w:val="หัวเรื่อง 9 อักขระ"/>
-    <w:basedOn w:val="a0"/>
-    <w:link w:val="9"/>
+  <w:style w:type="character" w:customStyle="1" w:styleId="Heading9Char">
+    <w:name w:val="Heading 9 Char"/>
+    <w:basedOn w:val="DefaultParagraphFont"/>
+    <w:link w:val="Heading9"/>
     <w:uiPriority w:val="9"/>
     <w:semiHidden/>
     <w:rsid w:val="00824612"/>
@@ -2522,11 +2530,11 @@
       <w:color w:val="272727" w:themeColor="text1" w:themeTint="D8"/>
     </w:rPr>
   </w:style>
-  <w:style w:type="paragraph" w:styleId="a3">
+  <w:style w:type="paragraph" w:styleId="Title">
     <w:name w:val="Title"/>
-    <w:basedOn w:val="a"/>
-    <w:next w:val="a"/>
-    <w:link w:val="a4"/>
+    <w:basedOn w:val="Normal"/>
+    <w:next w:val="Normal"/>
+    <w:link w:val="TitleChar"/>
     <w:uiPriority w:val="10"/>
     <w:qFormat/>
     <w:rsid w:val="00824612"/>
@@ -2544,10 +2552,10 @@
       <w14:ligatures w14:val="standardContextual"/>
     </w:rPr>
   </w:style>
-  <w:style w:type="character" w:customStyle="1" w:styleId="a4">
-    <w:name w:val="ชื่อเรื่อง อักขระ"/>
-    <w:basedOn w:val="a0"/>
-    <w:link w:val="a3"/>
+  <w:style w:type="character" w:customStyle="1" w:styleId="TitleChar">
+    <w:name w:val="Title Char"/>
+    <w:basedOn w:val="DefaultParagraphFont"/>
+    <w:link w:val="Title"/>
     <w:uiPriority w:val="10"/>
     <w:rsid w:val="00824612"/>
     <w:rPr>
@@ -2558,11 +2566,11 @@
       <w:szCs w:val="71"/>
     </w:rPr>
   </w:style>
-  <w:style w:type="paragraph" w:styleId="a5">
+  <w:style w:type="paragraph" w:styleId="Subtitle">
     <w:name w:val="Subtitle"/>
-    <w:basedOn w:val="a"/>
-    <w:next w:val="a"/>
-    <w:link w:val="a6"/>
+    <w:basedOn w:val="Normal"/>
+    <w:next w:val="Normal"/>
+    <w:link w:val="SubtitleChar"/>
     <w:uiPriority w:val="11"/>
     <w:qFormat/>
     <w:rsid w:val="00824612"/>
@@ -2583,10 +2591,10 @@
       <w14:ligatures w14:val="standardContextual"/>
     </w:rPr>
   </w:style>
-  <w:style w:type="character" w:customStyle="1" w:styleId="a6">
-    <w:name w:val="ชื่อเรื่องรอง อักขระ"/>
-    <w:basedOn w:val="a0"/>
-    <w:link w:val="a5"/>
+  <w:style w:type="character" w:customStyle="1" w:styleId="SubtitleChar">
+    <w:name w:val="Subtitle Char"/>
+    <w:basedOn w:val="DefaultParagraphFont"/>
+    <w:link w:val="Subtitle"/>
     <w:uiPriority w:val="11"/>
     <w:rsid w:val="00824612"/>
     <w:rPr>
@@ -2597,11 +2605,11 @@
       <w:szCs w:val="35"/>
     </w:rPr>
   </w:style>
-  <w:style w:type="paragraph" w:styleId="a7">
+  <w:style w:type="paragraph" w:styleId="Quote">
     <w:name w:val="Quote"/>
-    <w:basedOn w:val="a"/>
-    <w:next w:val="a"/>
-    <w:link w:val="a8"/>
+    <w:basedOn w:val="Normal"/>
+    <w:next w:val="Normal"/>
+    <w:link w:val="QuoteChar"/>
     <w:uiPriority w:val="29"/>
     <w:qFormat/>
     <w:rsid w:val="00824612"/>
@@ -2621,10 +2629,10 @@
       <w14:ligatures w14:val="standardContextual"/>
     </w:rPr>
   </w:style>
-  <w:style w:type="character" w:customStyle="1" w:styleId="a8">
-    <w:name w:val="คำอ้างอิง อักขระ"/>
-    <w:basedOn w:val="a0"/>
-    <w:link w:val="a7"/>
+  <w:style w:type="character" w:customStyle="1" w:styleId="QuoteChar">
+    <w:name w:val="Quote Char"/>
+    <w:basedOn w:val="DefaultParagraphFont"/>
+    <w:link w:val="Quote"/>
     <w:uiPriority w:val="29"/>
     <w:rsid w:val="00824612"/>
     <w:rPr>
@@ -2633,9 +2641,9 @@
       <w:color w:val="404040" w:themeColor="text1" w:themeTint="BF"/>
     </w:rPr>
   </w:style>
-  <w:style w:type="paragraph" w:styleId="a9">
+  <w:style w:type="paragraph" w:styleId="ListParagraph">
     <w:name w:val="List Paragraph"/>
-    <w:basedOn w:val="a"/>
+    <w:basedOn w:val="Normal"/>
     <w:uiPriority w:val="34"/>
     <w:qFormat/>
     <w:rsid w:val="00824612"/>
@@ -2653,9 +2661,9 @@
       <w14:ligatures w14:val="standardContextual"/>
     </w:rPr>
   </w:style>
-  <w:style w:type="character" w:styleId="aa">
+  <w:style w:type="character" w:styleId="IntenseEmphasis">
     <w:name w:val="Intense Emphasis"/>
-    <w:basedOn w:val="a0"/>
+    <w:basedOn w:val="DefaultParagraphFont"/>
     <w:uiPriority w:val="21"/>
     <w:qFormat/>
     <w:rsid w:val="00824612"/>
@@ -2665,11 +2673,11 @@
       <w:color w:val="2F5496" w:themeColor="accent1" w:themeShade="BF"/>
     </w:rPr>
   </w:style>
-  <w:style w:type="paragraph" w:styleId="ab">
+  <w:style w:type="paragraph" w:styleId="IntenseQuote">
     <w:name w:val="Intense Quote"/>
-    <w:basedOn w:val="a"/>
-    <w:next w:val="a"/>
-    <w:link w:val="ac"/>
+    <w:basedOn w:val="Normal"/>
+    <w:next w:val="Normal"/>
+    <w:link w:val="IntenseQuoteChar"/>
     <w:uiPriority w:val="30"/>
     <w:qFormat/>
     <w:rsid w:val="00824612"/>
@@ -2694,10 +2702,10 @@
       <w14:ligatures w14:val="standardContextual"/>
     </w:rPr>
   </w:style>
-  <w:style w:type="character" w:customStyle="1" w:styleId="ac">
-    <w:name w:val="ทำให้คำอ้างอิงเป็นสีเข้มขึ้น อักขระ"/>
-    <w:basedOn w:val="a0"/>
-    <w:link w:val="ab"/>
+  <w:style w:type="character" w:customStyle="1" w:styleId="IntenseQuoteChar">
+    <w:name w:val="Intense Quote Char"/>
+    <w:basedOn w:val="DefaultParagraphFont"/>
+    <w:link w:val="IntenseQuote"/>
     <w:uiPriority w:val="30"/>
     <w:rsid w:val="00824612"/>
     <w:rPr>
@@ -2706,9 +2714,9 @@
       <w:color w:val="2F5496" w:themeColor="accent1" w:themeShade="BF"/>
     </w:rPr>
   </w:style>
-  <w:style w:type="character" w:styleId="ad">
+  <w:style w:type="character" w:styleId="IntenseReference">
     <w:name w:val="Intense Reference"/>
-    <w:basedOn w:val="a0"/>
+    <w:basedOn w:val="DefaultParagraphFont"/>
     <w:uiPriority w:val="32"/>
     <w:qFormat/>
     <w:rsid w:val="00824612"/>
@@ -2720,9 +2728,9 @@
       <w:spacing w:val="5"/>
     </w:rPr>
   </w:style>
-  <w:style w:type="table" w:styleId="ae">
+  <w:style w:type="table" w:styleId="TableGrid">
     <w:name w:val="Table Grid"/>
-    <w:basedOn w:val="a1"/>
+    <w:basedOn w:val="TableNormal"/>
     <w:uiPriority w:val="39"/>
     <w:rsid w:val="00824612"/>
     <w:pPr>
@@ -2746,10 +2754,10 @@
       </w:tblBorders>
     </w:tblPr>
   </w:style>
-  <w:style w:type="paragraph" w:styleId="af">
+  <w:style w:type="paragraph" w:styleId="Header">
     <w:name w:val="header"/>
-    <w:basedOn w:val="a"/>
-    <w:link w:val="af0"/>
+    <w:basedOn w:val="Normal"/>
+    <w:link w:val="HeaderChar"/>
     <w:uiPriority w:val="99"/>
     <w:unhideWhenUsed/>
     <w:rsid w:val="00824612"/>
@@ -2764,10 +2772,10 @@
       <w:szCs w:val="30"/>
     </w:rPr>
   </w:style>
-  <w:style w:type="character" w:customStyle="1" w:styleId="af0">
-    <w:name w:val="หัวกระดาษ อักขระ"/>
-    <w:basedOn w:val="a0"/>
-    <w:link w:val="af"/>
+  <w:style w:type="character" w:customStyle="1" w:styleId="HeaderChar">
+    <w:name w:val="Header Char"/>
+    <w:basedOn w:val="DefaultParagraphFont"/>
+    <w:link w:val="Header"/>
     <w:uiPriority w:val="99"/>
     <w:rsid w:val="00824612"/>
     <w:rPr>
@@ -2779,10 +2787,10 @@
       <w14:ligatures w14:val="none"/>
     </w:rPr>
   </w:style>
-  <w:style w:type="paragraph" w:styleId="af1">
+  <w:style w:type="paragraph" w:styleId="Footer">
     <w:name w:val="footer"/>
-    <w:basedOn w:val="a"/>
-    <w:link w:val="af2"/>
+    <w:basedOn w:val="Normal"/>
+    <w:link w:val="FooterChar"/>
     <w:uiPriority w:val="99"/>
     <w:unhideWhenUsed/>
     <w:rsid w:val="00824612"/>
@@ -2797,10 +2805,10 @@
       <w:szCs w:val="30"/>
     </w:rPr>
   </w:style>
-  <w:style w:type="character" w:customStyle="1" w:styleId="af2">
-    <w:name w:val="ท้ายกระดาษ อักขระ"/>
-    <w:basedOn w:val="a0"/>
-    <w:link w:val="af1"/>
+  <w:style w:type="character" w:customStyle="1" w:styleId="FooterChar">
+    <w:name w:val="Footer Char"/>
+    <w:basedOn w:val="DefaultParagraphFont"/>
+    <w:link w:val="Footer"/>
     <w:uiPriority w:val="99"/>
     <w:rsid w:val="00824612"/>
     <w:rPr>

</xml_diff>